<commit_message>
Update Arborea Bible resource data for 2026-08-24 release
</commit_message>
<xml_diff>
--- a/arb/docx/31.content.docx
+++ b/arb/docx/31.content.docx
@@ -9,6 +9,8 @@
       </w:pPr>
       <w:r>
         <w:rPr>
+          <w:rtl/>
+          <w:cs/>
           <w:lang w:val="ar_AE" w:bidi="ar_AE"/>
         </w:rPr>
       </w:r>
@@ -20,12 +22,16 @@
       </w:pPr>
       <w:r>
         <w:rPr>
+          <w:rtl/>
+          <w:cs/>
           <w:lang w:val="ar_AE" w:bidi="ar_AE"/>
         </w:rPr>
         <w:t>Resource: unfoldingWord® Translation Questions</w:t>
       </w:r>
       <w:r>
         <w:rPr>
+          <w:rtl/>
+          <w:cs/>
           <w:lang w:val="ar_AE" w:bidi="ar_AE"/>
         </w:rPr>
       </w:r>
@@ -36,48 +42,64 @@
       </w:pPr>
       <w:r>
         <w:rPr>
+          <w:rtl/>
+          <w:cs/>
           <w:lang w:val="ar_AE" w:bidi="ar_AE"/>
         </w:rPr>
       </w:r>
       <w:r>
         <w:rPr>
           <w:b/>
+          <w:rtl/>
+          <w:cs/>
           <w:lang w:val="ar_AE" w:bidi="ar_AE"/>
         </w:rPr>
         <w:t>unfoldingWord® Translation Questions</w:t>
       </w:r>
       <w:r>
         <w:rPr>
+          <w:rtl/>
+          <w:cs/>
           <w:lang w:val="ar_AE" w:bidi="ar_AE"/>
         </w:rPr>
         <w:t xml:space="preserve"> © 2022 unfoldingWord. Released under CC BY-SA 4.0 license. </w:t>
       </w:r>
       <w:r>
         <w:rPr>
+          <w:rtl/>
+          <w:cs/>
           <w:lang w:val="ar_AE" w:bidi="ar_AE"/>
         </w:rPr>
         <w:t>unfoldingWord® Translation Questions</w:t>
       </w:r>
       <w:r>
         <w:rPr>
+          <w:rtl/>
+          <w:cs/>
           <w:lang w:val="ar_AE" w:bidi="ar_AE"/>
         </w:rPr>
         <w:t xml:space="preserve"> has been adapted in the following languages: Tok Pisin, Arabic (عربي), French (Français), Hindi (हिंदी), Indonesian (Bahasa Indonesia), Portuguese (Português), Russian (Русский), Spanish (Español), Swahili (Kiswahili), and Simplified Chinese (简体中文) from </w:t>
       </w:r>
       <w:r>
         <w:rPr>
+          <w:rtl/>
+          <w:cs/>
           <w:lang w:val="ar_AE" w:bidi="ar_AE"/>
         </w:rPr>
         <w:t>unfoldingWord® Translation Questions</w:t>
       </w:r>
       <w:r>
         <w:rPr>
+          <w:rtl/>
+          <w:cs/>
           <w:lang w:val="ar_AE" w:bidi="ar_AE"/>
         </w:rPr>
         <w:t xml:space="preserve"> © 2022 unfoldingWord. Released under CC BY-SA 4.0 license by Mission Mutual</w:t>
       </w:r>
       <w:r>
         <w:rPr>
+          <w:rtl/>
+          <w:cs/>
           <w:lang w:val="ar_AE" w:bidi="ar_AE"/>
         </w:rPr>
       </w:r>
@@ -89,6 +111,8 @@
       </w:pPr>
       <w:r>
         <w:rPr>
+          <w:rtl/>
+          <w:cs/>
           <w:lang w:val="ar_AE" w:bidi="ar_AE"/>
         </w:rPr>
         <w:t>unfoldingWord® Translation Questions</w:t>
@@ -118,6 +142,8 @@
       </w:pPr>
       <w:r>
         <w:rPr>
+          <w:rtl/>
+          <w:cs/>
           <w:lang w:val="ar_AE" w:bidi="ar_AE"/>
         </w:rPr>
       </w:r>
@@ -129,12 +155,16 @@
       </w:pPr>
       <w:r>
         <w:rPr>
+          <w:rtl/>
+          <w:cs/>
           <w:lang w:val="ar_AE" w:bidi="ar_AE"/>
         </w:rPr>
         <w:t>OBA</w:t>
       </w:r>
       <w:r>
         <w:rPr>
+          <w:rtl/>
+          <w:cs/>
           <w:lang w:val="ar_AE" w:bidi="ar_AE"/>
         </w:rPr>
       </w:r>
@@ -145,22 +175,30 @@
       </w:pPr>
       <w:r>
         <w:rPr>
-          <w:lang w:val="ar_AE" w:bidi="ar_AE"/>
-        </w:rPr>
-      </w:r>
-      <w:r>
-        <w:rPr>
+          <w:rtl/>
+          <w:cs/>
+          <w:lang w:val="ar_AE" w:bidi="ar_AE"/>
+        </w:rPr>
+      </w:r>
+      <w:r>
+        <w:rPr>
+          <w:rtl/>
+          <w:cs/>
           <w:lang w:val="ar_AE" w:bidi="ar_AE"/>
         </w:rPr>
         <w:t xml:space="preserve"> </w:t>
       </w:r>
       <w:r>
         <w:rPr>
-          <w:lang w:val="ar_AE" w:bidi="ar_AE"/>
-        </w:rPr>
-      </w:r>
-      <w:r>
-        <w:rPr>
+          <w:rtl/>
+          <w:cs/>
+          <w:lang w:val="ar_AE" w:bidi="ar_AE"/>
+        </w:rPr>
+      </w:r>
+      <w:r>
+        <w:rPr>
+          <w:rtl/>
+          <w:cs/>
           <w:lang w:val="ar_AE" w:bidi="ar_AE"/>
         </w:rPr>
       </w:r>
@@ -186,6 +224,8 @@
       </w:pPr>
       <w:r>
         <w:rPr>
+          <w:rtl/>
+          <w:cs/>
           <w:lang w:val="ar_AE" w:bidi="ar_AE"/>
         </w:rPr>
       </w:r>
@@ -197,12 +237,16 @@
       </w:pPr>
       <w:r>
         <w:rPr>
+          <w:rtl/>
+          <w:cs/>
           <w:lang w:val="ar_AE" w:bidi="ar_AE"/>
         </w:rPr>
         <w:t>عوبديا 1: 1</w:t>
       </w:r>
       <w:r>
         <w:rPr>
+          <w:rtl/>
+          <w:cs/>
           <w:lang w:val="ar_AE" w:bidi="ar_AE"/>
         </w:rPr>
       </w:r>
@@ -213,12 +257,16 @@
       </w:pPr>
       <w:r>
         <w:rPr>
+          <w:rtl/>
+          <w:cs/>
           <w:lang w:val="ar_AE" w:bidi="ar_AE"/>
         </w:rPr>
       </w:r>
       <w:r>
         <w:rPr>
           <w:b/>
+          <w:rtl/>
+          <w:cs/>
           <w:lang w:val="ar_AE" w:bidi="ar_AE"/>
         </w:rPr>
         <w:t>ما الهدف من إرسال الرب لرسول بين الأمم؟</w:t>
@@ -230,22 +278,30 @@
       </w:pPr>
       <w:r>
         <w:rPr>
-          <w:lang w:val="ar_AE" w:bidi="ar_AE"/>
-        </w:rPr>
-      </w:r>
-      <w:r>
-        <w:rPr>
+          <w:rtl/>
+          <w:cs/>
+          <w:lang w:val="ar_AE" w:bidi="ar_AE"/>
+        </w:rPr>
+      </w:r>
+      <w:r>
+        <w:rPr>
+          <w:rtl/>
+          <w:cs/>
           <w:lang w:val="ar_AE" w:bidi="ar_AE"/>
         </w:rPr>
         <w:t>أرسل الرب رسولًا إلى الأمم ليحثهم على النهوض للمعركة ضد أدوم.</w:t>
       </w:r>
       <w:r>
         <w:rPr>
-          <w:lang w:val="ar_AE" w:bidi="ar_AE"/>
-        </w:rPr>
-      </w:r>
-      <w:r>
-        <w:rPr>
+          <w:rtl/>
+          <w:cs/>
+          <w:lang w:val="ar_AE" w:bidi="ar_AE"/>
+        </w:rPr>
+      </w:r>
+      <w:r>
+        <w:rPr>
+          <w:rtl/>
+          <w:cs/>
           <w:lang w:val="ar_AE" w:bidi="ar_AE"/>
         </w:rPr>
       </w:r>
@@ -256,6 +312,8 @@
       </w:pPr>
       <w:r>
         <w:rPr>
+          <w:rtl/>
+          <w:cs/>
           <w:lang w:val="ar_AE" w:bidi="ar_AE"/>
         </w:rPr>
       </w:r>
@@ -267,12 +325,16 @@
       </w:pPr>
       <w:r>
         <w:rPr>
+          <w:rtl/>
+          <w:cs/>
           <w:lang w:val="ar_AE" w:bidi="ar_AE"/>
         </w:rPr>
         <w:t>عوبديا 1: 3</w:t>
       </w:r>
       <w:r>
         <w:rPr>
+          <w:rtl/>
+          <w:cs/>
           <w:lang w:val="ar_AE" w:bidi="ar_AE"/>
         </w:rPr>
       </w:r>
@@ -283,12 +345,16 @@
       </w:pPr>
       <w:r>
         <w:rPr>
+          <w:rtl/>
+          <w:cs/>
           <w:lang w:val="ar_AE" w:bidi="ar_AE"/>
         </w:rPr>
       </w:r>
       <w:r>
         <w:rPr>
           <w:b/>
+          <w:rtl/>
+          <w:cs/>
           <w:lang w:val="ar_AE" w:bidi="ar_AE"/>
         </w:rPr>
         <w:t>ما هي إحدى خطايا الأدوميين؟</w:t>
@@ -300,22 +366,30 @@
       </w:pPr>
       <w:r>
         <w:rPr>
-          <w:lang w:val="ar_AE" w:bidi="ar_AE"/>
-        </w:rPr>
-      </w:r>
-      <w:r>
-        <w:rPr>
+          <w:rtl/>
+          <w:cs/>
+          <w:lang w:val="ar_AE" w:bidi="ar_AE"/>
+        </w:rPr>
+      </w:r>
+      <w:r>
+        <w:rPr>
+          <w:rtl/>
+          <w:cs/>
           <w:lang w:val="ar_AE" w:bidi="ar_AE"/>
         </w:rPr>
         <w:t>كان الأدوميون يشعرون بالكبرياء في قلوبهم وظنوا أنهم لا يمكن أن يُهزموا أو يذلوا.</w:t>
       </w:r>
       <w:r>
         <w:rPr>
-          <w:lang w:val="ar_AE" w:bidi="ar_AE"/>
-        </w:rPr>
-      </w:r>
-      <w:r>
-        <w:rPr>
+          <w:rtl/>
+          <w:cs/>
+          <w:lang w:val="ar_AE" w:bidi="ar_AE"/>
+        </w:rPr>
+      </w:r>
+      <w:r>
+        <w:rPr>
+          <w:rtl/>
+          <w:cs/>
           <w:lang w:val="ar_AE" w:bidi="ar_AE"/>
         </w:rPr>
       </w:r>
@@ -326,6 +400,8 @@
       </w:pPr>
       <w:r>
         <w:rPr>
+          <w:rtl/>
+          <w:cs/>
           <w:lang w:val="ar_AE" w:bidi="ar_AE"/>
         </w:rPr>
       </w:r>
@@ -337,12 +413,16 @@
       </w:pPr>
       <w:r>
         <w:rPr>
+          <w:rtl/>
+          <w:cs/>
           <w:lang w:val="ar_AE" w:bidi="ar_AE"/>
         </w:rPr>
         <w:t>عوبديا 1: 7</w:t>
       </w:r>
       <w:r>
         <w:rPr>
+          <w:rtl/>
+          <w:cs/>
           <w:lang w:val="ar_AE" w:bidi="ar_AE"/>
         </w:rPr>
       </w:r>
@@ -353,12 +433,16 @@
       </w:pPr>
       <w:r>
         <w:rPr>
+          <w:rtl/>
+          <w:cs/>
           <w:lang w:val="ar_AE" w:bidi="ar_AE"/>
         </w:rPr>
       </w:r>
       <w:r>
         <w:rPr>
           <w:b/>
+          <w:rtl/>
+          <w:cs/>
           <w:lang w:val="ar_AE" w:bidi="ar_AE"/>
         </w:rPr>
         <w:t>من سيخدع ويهزم أدوم؟</w:t>
@@ -370,22 +454,30 @@
       </w:pPr>
       <w:r>
         <w:rPr>
-          <w:lang w:val="ar_AE" w:bidi="ar_AE"/>
-        </w:rPr>
-      </w:r>
-      <w:r>
-        <w:rPr>
+          <w:rtl/>
+          <w:cs/>
+          <w:lang w:val="ar_AE" w:bidi="ar_AE"/>
+        </w:rPr>
+      </w:r>
+      <w:r>
+        <w:rPr>
+          <w:rtl/>
+          <w:cs/>
           <w:lang w:val="ar_AE" w:bidi="ar_AE"/>
         </w:rPr>
         <w:t>من كانوا في تحالف سلام مع أدوم سيخدعون أدوم ويغلبونهم.</w:t>
       </w:r>
       <w:r>
         <w:rPr>
-          <w:lang w:val="ar_AE" w:bidi="ar_AE"/>
-        </w:rPr>
-      </w:r>
-      <w:r>
-        <w:rPr>
+          <w:rtl/>
+          <w:cs/>
+          <w:lang w:val="ar_AE" w:bidi="ar_AE"/>
+        </w:rPr>
+      </w:r>
+      <w:r>
+        <w:rPr>
+          <w:rtl/>
+          <w:cs/>
           <w:lang w:val="ar_AE" w:bidi="ar_AE"/>
         </w:rPr>
       </w:r>
@@ -396,6 +488,8 @@
       </w:pPr>
       <w:r>
         <w:rPr>
+          <w:rtl/>
+          <w:cs/>
           <w:lang w:val="ar_AE" w:bidi="ar_AE"/>
         </w:rPr>
       </w:r>
@@ -407,12 +501,16 @@
       </w:pPr>
       <w:r>
         <w:rPr>
+          <w:rtl/>
+          <w:cs/>
           <w:lang w:val="ar_AE" w:bidi="ar_AE"/>
         </w:rPr>
         <w:t>عوبديا 1: 10</w:t>
       </w:r>
       <w:r>
         <w:rPr>
+          <w:rtl/>
+          <w:cs/>
           <w:lang w:val="ar_AE" w:bidi="ar_AE"/>
         </w:rPr>
       </w:r>
@@ -423,12 +521,16 @@
       </w:pPr>
       <w:r>
         <w:rPr>
+          <w:rtl/>
+          <w:cs/>
           <w:lang w:val="ar_AE" w:bidi="ar_AE"/>
         </w:rPr>
       </w:r>
       <w:r>
         <w:rPr>
           <w:b/>
+          <w:rtl/>
+          <w:cs/>
           <w:lang w:val="ar_AE" w:bidi="ar_AE"/>
         </w:rPr>
         <w:t>لماذا سيغمر الخزي أدوم وينقرض إلى الأبد؟</w:t>
@@ -440,22 +542,30 @@
       </w:pPr>
       <w:r>
         <w:rPr>
-          <w:lang w:val="ar_AE" w:bidi="ar_AE"/>
-        </w:rPr>
-      </w:r>
-      <w:r>
-        <w:rPr>
+          <w:rtl/>
+          <w:cs/>
+          <w:lang w:val="ar_AE" w:bidi="ar_AE"/>
+        </w:rPr>
+      </w:r>
+      <w:r>
+        <w:rPr>
+          <w:rtl/>
+          <w:cs/>
           <w:lang w:val="ar_AE" w:bidi="ar_AE"/>
         </w:rPr>
         <w:t>سيُغمر أدوم الخزي وينقرض إلى الأبد بسبب جوره على أخيه يعقوب.</w:t>
       </w:r>
       <w:r>
         <w:rPr>
-          <w:lang w:val="ar_AE" w:bidi="ar_AE"/>
-        </w:rPr>
-      </w:r>
-      <w:r>
-        <w:rPr>
+          <w:rtl/>
+          <w:cs/>
+          <w:lang w:val="ar_AE" w:bidi="ar_AE"/>
+        </w:rPr>
+      </w:r>
+      <w:r>
+        <w:rPr>
+          <w:rtl/>
+          <w:cs/>
           <w:lang w:val="ar_AE" w:bidi="ar_AE"/>
         </w:rPr>
       </w:r>
@@ -466,6 +576,8 @@
       </w:pPr>
       <w:r>
         <w:rPr>
+          <w:rtl/>
+          <w:cs/>
           <w:lang w:val="ar_AE" w:bidi="ar_AE"/>
         </w:rPr>
       </w:r>
@@ -477,12 +589,16 @@
       </w:pPr>
       <w:r>
         <w:rPr>
+          <w:rtl/>
+          <w:cs/>
           <w:lang w:val="ar_AE" w:bidi="ar_AE"/>
         </w:rPr>
         <w:t>عوبديا 1: 11</w:t>
       </w:r>
       <w:r>
         <w:rPr>
+          <w:rtl/>
+          <w:cs/>
           <w:lang w:val="ar_AE" w:bidi="ar_AE"/>
         </w:rPr>
       </w:r>
@@ -493,12 +609,16 @@
       </w:pPr>
       <w:r>
         <w:rPr>
+          <w:rtl/>
+          <w:cs/>
           <w:lang w:val="ar_AE" w:bidi="ar_AE"/>
         </w:rPr>
       </w:r>
       <w:r>
         <w:rPr>
           <w:b/>
+          <w:rtl/>
+          <w:cs/>
           <w:lang w:val="ar_AE" w:bidi="ar_AE"/>
         </w:rPr>
         <w:t>ماذا حدث في اليوم الذي ابتعد فيه أدوم عن يعقوب؟</w:t>
@@ -510,22 +630,30 @@
       </w:pPr>
       <w:r>
         <w:rPr>
-          <w:lang w:val="ar_AE" w:bidi="ar_AE"/>
-        </w:rPr>
-      </w:r>
-      <w:r>
-        <w:rPr>
+          <w:rtl/>
+          <w:cs/>
+          <w:lang w:val="ar_AE" w:bidi="ar_AE"/>
+        </w:rPr>
+      </w:r>
+      <w:r>
+        <w:rPr>
+          <w:rtl/>
+          <w:cs/>
           <w:lang w:val="ar_AE" w:bidi="ar_AE"/>
         </w:rPr>
         <w:t>في ذلك اليوم، دخل الغرباء أبواب يعقوب ونهبوا ثرواته.</w:t>
       </w:r>
       <w:r>
         <w:rPr>
-          <w:lang w:val="ar_AE" w:bidi="ar_AE"/>
-        </w:rPr>
-      </w:r>
-      <w:r>
-        <w:rPr>
+          <w:rtl/>
+          <w:cs/>
+          <w:lang w:val="ar_AE" w:bidi="ar_AE"/>
+        </w:rPr>
+      </w:r>
+      <w:r>
+        <w:rPr>
+          <w:rtl/>
+          <w:cs/>
           <w:lang w:val="ar_AE" w:bidi="ar_AE"/>
         </w:rPr>
       </w:r>
@@ -536,6 +664,8 @@
       </w:pPr>
       <w:r>
         <w:rPr>
+          <w:rtl/>
+          <w:cs/>
           <w:lang w:val="ar_AE" w:bidi="ar_AE"/>
         </w:rPr>
       </w:r>
@@ -547,12 +677,16 @@
       </w:pPr>
       <w:r>
         <w:rPr>
+          <w:rtl/>
+          <w:cs/>
           <w:lang w:val="ar_AE" w:bidi="ar_AE"/>
         </w:rPr>
         <w:t>عوبديا 1: 12</w:t>
       </w:r>
       <w:r>
         <w:rPr>
+          <w:rtl/>
+          <w:cs/>
           <w:lang w:val="ar_AE" w:bidi="ar_AE"/>
         </w:rPr>
       </w:r>
@@ -563,12 +697,16 @@
       </w:pPr>
       <w:r>
         <w:rPr>
+          <w:rtl/>
+          <w:cs/>
           <w:lang w:val="ar_AE" w:bidi="ar_AE"/>
         </w:rPr>
       </w:r>
       <w:r>
         <w:rPr>
           <w:b/>
+          <w:rtl/>
+          <w:cs/>
           <w:lang w:val="ar_AE" w:bidi="ar_AE"/>
         </w:rPr>
         <w:t>ماذا طلب الرب من أدوم ألا يفعل تجاه يهوذا في يوم بليّة يهوذا؟</w:t>
@@ -580,22 +718,30 @@
       </w:pPr>
       <w:r>
         <w:rPr>
-          <w:lang w:val="ar_AE" w:bidi="ar_AE"/>
-        </w:rPr>
-      </w:r>
-      <w:r>
-        <w:rPr>
+          <w:rtl/>
+          <w:cs/>
+          <w:lang w:val="ar_AE" w:bidi="ar_AE"/>
+        </w:rPr>
+      </w:r>
+      <w:r>
+        <w:rPr>
+          <w:rtl/>
+          <w:cs/>
           <w:lang w:val="ar_AE" w:bidi="ar_AE"/>
         </w:rPr>
         <w:t>قال الرب إنه لم يكن ينبغي لأدوم أن ينظر أو يفرح أو يتفاخر بفمه.</w:t>
       </w:r>
       <w:r>
         <w:rPr>
-          <w:lang w:val="ar_AE" w:bidi="ar_AE"/>
-        </w:rPr>
-      </w:r>
-      <w:r>
-        <w:rPr>
+          <w:rtl/>
+          <w:cs/>
+          <w:lang w:val="ar_AE" w:bidi="ar_AE"/>
+        </w:rPr>
+      </w:r>
+      <w:r>
+        <w:rPr>
+          <w:rtl/>
+          <w:cs/>
           <w:lang w:val="ar_AE" w:bidi="ar_AE"/>
         </w:rPr>
       </w:r>
@@ -606,6 +752,8 @@
       </w:pPr>
       <w:r>
         <w:rPr>
+          <w:rtl/>
+          <w:cs/>
           <w:lang w:val="ar_AE" w:bidi="ar_AE"/>
         </w:rPr>
       </w:r>
@@ -617,12 +765,16 @@
       </w:pPr>
       <w:r>
         <w:rPr>
+          <w:rtl/>
+          <w:cs/>
           <w:lang w:val="ar_AE" w:bidi="ar_AE"/>
         </w:rPr>
         <w:t>عوبديا 1: 13</w:t>
       </w:r>
       <w:r>
         <w:rPr>
+          <w:rtl/>
+          <w:cs/>
           <w:lang w:val="ar_AE" w:bidi="ar_AE"/>
         </w:rPr>
       </w:r>
@@ -633,12 +785,16 @@
       </w:pPr>
       <w:r>
         <w:rPr>
+          <w:rtl/>
+          <w:cs/>
           <w:lang w:val="ar_AE" w:bidi="ar_AE"/>
         </w:rPr>
       </w:r>
       <w:r>
         <w:rPr>
           <w:b/>
+          <w:rtl/>
+          <w:cs/>
           <w:lang w:val="ar_AE" w:bidi="ar_AE"/>
         </w:rPr>
         <w:t>ماذا طلب الرب من أدوم ألا يفعل تجاه يهوذا في يوم مصيبة يهوذا؟</w:t>
@@ -650,22 +806,30 @@
       </w:pPr>
       <w:r>
         <w:rPr>
-          <w:lang w:val="ar_AE" w:bidi="ar_AE"/>
-        </w:rPr>
-      </w:r>
-      <w:r>
-        <w:rPr>
+          <w:rtl/>
+          <w:cs/>
+          <w:lang w:val="ar_AE" w:bidi="ar_AE"/>
+        </w:rPr>
+      </w:r>
+      <w:r>
+        <w:rPr>
+          <w:rtl/>
+          <w:cs/>
           <w:lang w:val="ar_AE" w:bidi="ar_AE"/>
         </w:rPr>
         <w:t>قال الرب إنه لا ينبغي لأدوم أن يدخل أبواب يهوذا، أو يفرح، أو ينهب ثروة يهوذا في يوم مصيبته.</w:t>
       </w:r>
       <w:r>
         <w:rPr>
-          <w:lang w:val="ar_AE" w:bidi="ar_AE"/>
-        </w:rPr>
-      </w:r>
-      <w:r>
-        <w:rPr>
+          <w:rtl/>
+          <w:cs/>
+          <w:lang w:val="ar_AE" w:bidi="ar_AE"/>
+        </w:rPr>
+      </w:r>
+      <w:r>
+        <w:rPr>
+          <w:rtl/>
+          <w:cs/>
           <w:lang w:val="ar_AE" w:bidi="ar_AE"/>
         </w:rPr>
       </w:r>
@@ -676,6 +840,8 @@
       </w:pPr>
       <w:r>
         <w:rPr>
+          <w:rtl/>
+          <w:cs/>
           <w:lang w:val="ar_AE" w:bidi="ar_AE"/>
         </w:rPr>
       </w:r>
@@ -687,12 +853,16 @@
       </w:pPr>
       <w:r>
         <w:rPr>
+          <w:rtl/>
+          <w:cs/>
           <w:lang w:val="ar_AE" w:bidi="ar_AE"/>
         </w:rPr>
         <w:t>عوبديا 1: 15</w:t>
       </w:r>
       <w:r>
         <w:rPr>
+          <w:rtl/>
+          <w:cs/>
           <w:lang w:val="ar_AE" w:bidi="ar_AE"/>
         </w:rPr>
       </w:r>
@@ -703,12 +873,16 @@
       </w:pPr>
       <w:r>
         <w:rPr>
+          <w:rtl/>
+          <w:cs/>
           <w:lang w:val="ar_AE" w:bidi="ar_AE"/>
         </w:rPr>
       </w:r>
       <w:r>
         <w:rPr>
           <w:b/>
+          <w:rtl/>
+          <w:cs/>
           <w:lang w:val="ar_AE" w:bidi="ar_AE"/>
         </w:rPr>
         <w:t>ماذا قال الرب عمّا سيحدث ويرتد على رأس أدوم؟</w:t>
@@ -720,22 +894,30 @@
       </w:pPr>
       <w:r>
         <w:rPr>
-          <w:lang w:val="ar_AE" w:bidi="ar_AE"/>
-        </w:rPr>
-      </w:r>
-      <w:r>
-        <w:rPr>
+          <w:rtl/>
+          <w:cs/>
+          <w:lang w:val="ar_AE" w:bidi="ar_AE"/>
+        </w:rPr>
+      </w:r>
+      <w:r>
+        <w:rPr>
+          <w:rtl/>
+          <w:cs/>
           <w:lang w:val="ar_AE" w:bidi="ar_AE"/>
         </w:rPr>
         <w:t>قال الرب إن عقاب أدوم سيرتد على أدوم نفسها.</w:t>
       </w:r>
       <w:r>
         <w:rPr>
-          <w:lang w:val="ar_AE" w:bidi="ar_AE"/>
-        </w:rPr>
-      </w:r>
-      <w:r>
-        <w:rPr>
+          <w:rtl/>
+          <w:cs/>
+          <w:lang w:val="ar_AE" w:bidi="ar_AE"/>
+        </w:rPr>
+      </w:r>
+      <w:r>
+        <w:rPr>
+          <w:rtl/>
+          <w:cs/>
           <w:lang w:val="ar_AE" w:bidi="ar_AE"/>
         </w:rPr>
       </w:r>
@@ -746,6 +928,8 @@
       </w:pPr>
       <w:r>
         <w:rPr>
+          <w:rtl/>
+          <w:cs/>
           <w:lang w:val="ar_AE" w:bidi="ar_AE"/>
         </w:rPr>
       </w:r>
@@ -757,12 +941,16 @@
       </w:pPr>
       <w:r>
         <w:rPr>
+          <w:rtl/>
+          <w:cs/>
           <w:lang w:val="ar_AE" w:bidi="ar_AE"/>
         </w:rPr>
         <w:t>عوبديا 1: 17</w:t>
       </w:r>
       <w:r>
         <w:rPr>
+          <w:rtl/>
+          <w:cs/>
           <w:lang w:val="ar_AE" w:bidi="ar_AE"/>
         </w:rPr>
       </w:r>
@@ -773,12 +961,16 @@
       </w:pPr>
       <w:r>
         <w:rPr>
+          <w:rtl/>
+          <w:cs/>
           <w:lang w:val="ar_AE" w:bidi="ar_AE"/>
         </w:rPr>
       </w:r>
       <w:r>
         <w:rPr>
           <w:b/>
+          <w:rtl/>
+          <w:cs/>
           <w:lang w:val="ar_AE" w:bidi="ar_AE"/>
         </w:rPr>
         <w:t>ما الذي في قدرة البعض في جبل صهيون أن يفعله على الرغْم من بليّة يهوذا؟</w:t>
@@ -790,22 +982,30 @@
       </w:pPr>
       <w:r>
         <w:rPr>
-          <w:lang w:val="ar_AE" w:bidi="ar_AE"/>
-        </w:rPr>
-      </w:r>
-      <w:r>
-        <w:rPr>
+          <w:rtl/>
+          <w:cs/>
+          <w:lang w:val="ar_AE" w:bidi="ar_AE"/>
+        </w:rPr>
+      </w:r>
+      <w:r>
+        <w:rPr>
+          <w:rtl/>
+          <w:cs/>
           <w:lang w:val="ar_AE" w:bidi="ar_AE"/>
         </w:rPr>
         <w:t>سيتمكن البعض في جبل صهيون من الهرب بالرغْم من بليّة يهوذا.</w:t>
       </w:r>
       <w:r>
         <w:rPr>
-          <w:lang w:val="ar_AE" w:bidi="ar_AE"/>
-        </w:rPr>
-      </w:r>
-      <w:r>
-        <w:rPr>
+          <w:rtl/>
+          <w:cs/>
+          <w:lang w:val="ar_AE" w:bidi="ar_AE"/>
+        </w:rPr>
+      </w:r>
+      <w:r>
+        <w:rPr>
+          <w:rtl/>
+          <w:cs/>
           <w:lang w:val="ar_AE" w:bidi="ar_AE"/>
         </w:rPr>
       </w:r>
@@ -816,6 +1016,8 @@
       </w:pPr>
       <w:r>
         <w:rPr>
+          <w:rtl/>
+          <w:cs/>
           <w:lang w:val="ar_AE" w:bidi="ar_AE"/>
         </w:rPr>
       </w:r>
@@ -827,12 +1029,16 @@
       </w:pPr>
       <w:r>
         <w:rPr>
+          <w:rtl/>
+          <w:cs/>
           <w:lang w:val="ar_AE" w:bidi="ar_AE"/>
         </w:rPr>
         <w:t>عوبديا 1: 18</w:t>
       </w:r>
       <w:r>
         <w:rPr>
+          <w:rtl/>
+          <w:cs/>
           <w:lang w:val="ar_AE" w:bidi="ar_AE"/>
         </w:rPr>
       </w:r>
@@ -843,12 +1049,16 @@
       </w:pPr>
       <w:r>
         <w:rPr>
+          <w:rtl/>
+          <w:cs/>
           <w:lang w:val="ar_AE" w:bidi="ar_AE"/>
         </w:rPr>
       </w:r>
       <w:r>
         <w:rPr>
           <w:b/>
+          <w:rtl/>
+          <w:cs/>
           <w:lang w:val="ar_AE" w:bidi="ar_AE"/>
         </w:rPr>
         <w:t>كم من الأدوميين سيتمكن من الهرب من دينونة الرب؟</w:t>
@@ -860,22 +1070,30 @@
       </w:pPr>
       <w:r>
         <w:rPr>
-          <w:lang w:val="ar_AE" w:bidi="ar_AE"/>
-        </w:rPr>
-      </w:r>
-      <w:r>
-        <w:rPr>
+          <w:rtl/>
+          <w:cs/>
+          <w:lang w:val="ar_AE" w:bidi="ar_AE"/>
+        </w:rPr>
+      </w:r>
+      <w:r>
+        <w:rPr>
+          <w:rtl/>
+          <w:cs/>
           <w:lang w:val="ar_AE" w:bidi="ar_AE"/>
         </w:rPr>
         <w:t>لن ينجو أحد في أدوم بعدما تكلم الرب بالقضاء (الدينونة).</w:t>
       </w:r>
       <w:r>
         <w:rPr>
-          <w:lang w:val="ar_AE" w:bidi="ar_AE"/>
-        </w:rPr>
-      </w:r>
-      <w:r>
-        <w:rPr>
+          <w:rtl/>
+          <w:cs/>
+          <w:lang w:val="ar_AE" w:bidi="ar_AE"/>
+        </w:rPr>
+      </w:r>
+      <w:r>
+        <w:rPr>
+          <w:rtl/>
+          <w:cs/>
           <w:lang w:val="ar_AE" w:bidi="ar_AE"/>
         </w:rPr>
       </w:r>
@@ -886,6 +1104,8 @@
       </w:pPr>
       <w:r>
         <w:rPr>
+          <w:rtl/>
+          <w:cs/>
           <w:lang w:val="ar_AE" w:bidi="ar_AE"/>
         </w:rPr>
       </w:r>
@@ -897,12 +1117,16 @@
       </w:pPr>
       <w:r>
         <w:rPr>
+          <w:rtl/>
+          <w:cs/>
           <w:lang w:val="ar_AE" w:bidi="ar_AE"/>
         </w:rPr>
         <w:t>عوبديا 1: 19</w:t>
       </w:r>
       <w:r>
         <w:rPr>
+          <w:rtl/>
+          <w:cs/>
           <w:lang w:val="ar_AE" w:bidi="ar_AE"/>
         </w:rPr>
       </w:r>
@@ -913,12 +1137,16 @@
       </w:pPr>
       <w:r>
         <w:rPr>
+          <w:rtl/>
+          <w:cs/>
           <w:lang w:val="ar_AE" w:bidi="ar_AE"/>
         </w:rPr>
       </w:r>
       <w:r>
         <w:rPr>
           <w:b/>
+          <w:rtl/>
+          <w:cs/>
           <w:lang w:val="ar_AE" w:bidi="ar_AE"/>
         </w:rPr>
         <w:t>من الذي سيملك جبل عيسو لاحقًا؟</w:t>
@@ -930,22 +1158,30 @@
       </w:pPr>
       <w:r>
         <w:rPr>
-          <w:lang w:val="ar_AE" w:bidi="ar_AE"/>
-        </w:rPr>
-      </w:r>
-      <w:r>
-        <w:rPr>
+          <w:rtl/>
+          <w:cs/>
+          <w:lang w:val="ar_AE" w:bidi="ar_AE"/>
+        </w:rPr>
+      </w:r>
+      <w:r>
+        <w:rPr>
+          <w:rtl/>
+          <w:cs/>
           <w:lang w:val="ar_AE" w:bidi="ar_AE"/>
         </w:rPr>
         <w:t>أهل الجَنُوب (النّقب) سيملكون جبل عيسو.</w:t>
       </w:r>
       <w:r>
         <w:rPr>
-          <w:lang w:val="ar_AE" w:bidi="ar_AE"/>
-        </w:rPr>
-      </w:r>
-      <w:r>
-        <w:rPr>
+          <w:rtl/>
+          <w:cs/>
+          <w:lang w:val="ar_AE" w:bidi="ar_AE"/>
+        </w:rPr>
+      </w:r>
+      <w:r>
+        <w:rPr>
+          <w:rtl/>
+          <w:cs/>
           <w:lang w:val="ar_AE" w:bidi="ar_AE"/>
         </w:rPr>
       </w:r>
@@ -956,6 +1192,8 @@
       </w:pPr>
       <w:r>
         <w:rPr>
+          <w:rtl/>
+          <w:cs/>
           <w:lang w:val="ar_AE" w:bidi="ar_AE"/>
         </w:rPr>
       </w:r>
@@ -967,12 +1205,16 @@
       </w:pPr>
       <w:r>
         <w:rPr>
+          <w:rtl/>
+          <w:cs/>
           <w:lang w:val="ar_AE" w:bidi="ar_AE"/>
         </w:rPr>
         <w:t>عوبديا 1: 21</w:t>
       </w:r>
       <w:r>
         <w:rPr>
+          <w:rtl/>
+          <w:cs/>
           <w:lang w:val="ar_AE" w:bidi="ar_AE"/>
         </w:rPr>
       </w:r>
@@ -983,12 +1225,16 @@
       </w:pPr>
       <w:r>
         <w:rPr>
+          <w:rtl/>
+          <w:cs/>
           <w:lang w:val="ar_AE" w:bidi="ar_AE"/>
         </w:rPr>
       </w:r>
       <w:r>
         <w:rPr>
           <w:b/>
+          <w:rtl/>
+          <w:cs/>
           <w:lang w:val="ar_AE" w:bidi="ar_AE"/>
         </w:rPr>
         <w:t>من أي موضع سيُدان جبل عيسو؟</w:t>
@@ -1000,22 +1246,30 @@
       </w:pPr>
       <w:r>
         <w:rPr>
-          <w:lang w:val="ar_AE" w:bidi="ar_AE"/>
-        </w:rPr>
-      </w:r>
-      <w:r>
-        <w:rPr>
+          <w:rtl/>
+          <w:cs/>
+          <w:lang w:val="ar_AE" w:bidi="ar_AE"/>
+        </w:rPr>
+      </w:r>
+      <w:r>
+        <w:rPr>
+          <w:rtl/>
+          <w:cs/>
           <w:lang w:val="ar_AE" w:bidi="ar_AE"/>
         </w:rPr>
         <w:t>من جبل صهيون ستكون إدانة جبل عيسو.</w:t>
       </w:r>
       <w:r>
         <w:rPr>
-          <w:lang w:val="ar_AE" w:bidi="ar_AE"/>
-        </w:rPr>
-      </w:r>
-      <w:r>
-        <w:rPr>
+          <w:rtl/>
+          <w:cs/>
+          <w:lang w:val="ar_AE" w:bidi="ar_AE"/>
+        </w:rPr>
+      </w:r>
+      <w:r>
+        <w:rPr>
+          <w:rtl/>
+          <w:cs/>
           <w:lang w:val="ar_AE" w:bidi="ar_AE"/>
         </w:rPr>
       </w:r>

</xml_diff>